<commit_message>
fix(examples/word/textbox): tighten Scenario 1 VML fallback
The Scenario 1 mc:Fallback VML shape was missing standard MSO attrs
(o:spt on shapetype, o:spid / position:absolute style on v:shape,
o:connecttype on v:path) and had no <w10:wrap>. Word's strict parser
on the Fallback path tolerated this in some configurations but failed
in others. Spell out the full attribute set so the fallback matches
what Word itself emits.
</commit_message>
<xml_diff>
--- a/examples/word/textbox.docx
+++ b/examples/word/textbox.docx
@@ -1,7 +1,7 @@
 
 <file path=word/document.xml><?xml version="1.0" encoding="utf-8"?>
-<w:document xmlns:wp="http://schemas.openxmlformats.org/drawingml/2006/wordprocessingDrawing" xmlns:a="http://schemas.openxmlformats.org/drawingml/2006/main" xmlns:wps="http://schemas.microsoft.com/office/word/2010/wordprocessingShape" xmlns:v="urn:schemas-microsoft-com:vml" xmlns:w="http://schemas.openxmlformats.org/wordprocessingml/2006/main" xmlns:mc="http://schemas.openxmlformats.org/markup-compatibility/2006" xmlns:w14="http://schemas.microsoft.com/office/word/2010/wordml" mc:Ignorable="w14">
-  <w:body xmlns:w="http://schemas.openxmlformats.org/wordprocessingml/2006/main" xmlns:mc="http://schemas.openxmlformats.org/markup-compatibility/2006" xmlns:w14="http://schemas.microsoft.com/office/word/2010/wordml" xmlns:wp="http://schemas.openxmlformats.org/drawingml/2006/wordprocessingDrawing" xmlns:a="http://schemas.openxmlformats.org/drawingml/2006/main" xmlns:wps="http://schemas.microsoft.com/office/word/2010/wordprocessingShape" xmlns:v="urn:schemas-microsoft-com:vml">
+<w:document xmlns:r="http://schemas.openxmlformats.org/officeDocument/2006/relationships" xmlns:m="http://schemas.openxmlformats.org/officeDocument/2006/math" xmlns:v="urn:schemas-microsoft-com:vml" xmlns:o="urn:schemas-microsoft-com:office:office" xmlns:w10="urn:schemas-microsoft-com:office:word" xmlns:wne="http://schemas.microsoft.com/office/word/2006/wordml" xmlns:wp="http://schemas.openxmlformats.org/drawingml/2006/wordprocessingDrawing" xmlns:wp14="http://schemas.microsoft.com/office/word/2010/wordprocessingDrawing" xmlns:a="http://schemas.openxmlformats.org/drawingml/2006/main" xmlns:pic="http://schemas.openxmlformats.org/drawingml/2006/picture" xmlns:wps="http://schemas.microsoft.com/office/word/2010/wordprocessingShape" xmlns:wpg="http://schemas.microsoft.com/office/word/2010/wordprocessingGroup" xmlns:wpi="http://schemas.microsoft.com/office/word/2010/wordprocessingInk" xmlns:wpc="http://schemas.microsoft.com/office/word/2010/wordprocessingCanvas" xmlns:w15="http://schemas.microsoft.com/office/word/2012/wordml" xmlns:mc="http://schemas.openxmlformats.org/markup-compatibility/2006" xmlns:w="http://schemas.openxmlformats.org/wordprocessingml/2006/main" xmlns:w14="http://schemas.microsoft.com/office/word/2010/wordml" mc:Ignorable="w14 w15 wp14">
+  <w:body xmlns:r="http://schemas.openxmlformats.org/officeDocument/2006/relationships" xmlns:m="http://schemas.openxmlformats.org/officeDocument/2006/math" xmlns:v="urn:schemas-microsoft-com:vml" xmlns:o="urn:schemas-microsoft-com:office:office" xmlns:w10="urn:schemas-microsoft-com:office:word" xmlns:wne="http://schemas.microsoft.com/office/word/2006/wordml" xmlns:wp="http://schemas.openxmlformats.org/drawingml/2006/wordprocessingDrawing" xmlns:wp14="http://schemas.microsoft.com/office/word/2010/wordprocessingDrawing" xmlns:a="http://schemas.openxmlformats.org/drawingml/2006/main" xmlns:pic="http://schemas.openxmlformats.org/drawingml/2006/picture" xmlns:wps="http://schemas.microsoft.com/office/word/2010/wordprocessingShape" xmlns:wpg="http://schemas.microsoft.com/office/word/2010/wordprocessingGroup" xmlns:wpi="http://schemas.microsoft.com/office/word/2010/wordprocessingInk" xmlns:wpc="http://schemas.microsoft.com/office/word/2010/wordprocessingCanvas" xmlns:w15="http://schemas.microsoft.com/office/word/2012/wordml" xmlns:mc="http://schemas.openxmlformats.org/markup-compatibility/2006" xmlns:w="http://schemas.openxmlformats.org/wordprocessingml/2006/main" xmlns:w14="http://schemas.microsoft.com/office/word/2010/wordml">
     <w:p>
       <w:pPr>
         <w:pStyle w:val="Heading1"/>
@@ -36,7 +36,7 @@
         <mc:AlternateContent>
           <mc:Choice Requires="wps">
             <w:drawing>
-              <wp:anchor xmlns:wp="http://schemas.openxmlformats.org/drawingml/2006/wordprocessingDrawing" distT="0" distB="0" distL="114300" distR="114300" simplePos="0" relativeHeight="251659264" behindDoc="0" locked="0" layoutInCell="1" allowOverlap="1">
+              <wp:anchor distT="0" distB="0" distL="114300" distR="114300" simplePos="0" relativeHeight="251659264" behindDoc="0" locked="0" layoutInCell="1" allowOverlap="1">
                 <wp:simplePos x="0" y="0"/>
                 <wp:positionH relativeFrom="column">
                   <wp:posOffset>0</wp:posOffset>
@@ -48,9 +48,9 @@
                 <wp:effectExtent l="0" t="0" r="0" b="0"/>
                 <wp:wrapTopAndBottom/>
                 <wp:docPr id="1" name="TextBox 1"/>
-                <a:graphic xmlns:a="http://schemas.openxmlformats.org/drawingml/2006/main">
+                <a:graphic>
                   <a:graphicData uri="http://schemas.microsoft.com/office/word/2010/wordprocessingShape">
-                    <wps:wsp xmlns:wps="http://schemas.microsoft.com/office/word/2010/wordprocessingShape">
+                    <wps:wsp>
                       <wps:cNvSpPr txBox="1"/>
                       <wps:spPr>
                         <a:xfrm>
@@ -100,11 +100,11 @@
           </mc:Choice>
           <mc:Fallback>
             <w:pict>
-              <v:shapetype xmlns:v="urn:schemas-microsoft-com:vml" id="_x0000_t202" coordsize="21600,21600" path="m,l,21600r21600,l21600,xe">
+              <v:shapetype id="_x0000_t202" coordsize="21600,21600" o:spt="202" path="m,l,21600r21600,l21600,xe">
                 <v:stroke joinstyle="miter"/>
-                <v:path gradientshapeok="t"/>
+                <v:path gradientshapeok="t" o:connecttype="rect"/>
               </v:shapetype>
-              <v:shape xmlns:v="urn:schemas-microsoft-com:vml" id="TextBox1" style="width:425.2pt;height:94.5pt;mso-wrap-style:square" fillcolor="#E6F3FF" strokecolor="#0070C0" strokeweight="2pt" type="#_x0000_t202">
+              <v:shape id="TextBox1" style="position:absolute;margin-left:0;margin-top:0;width:425.2pt;height:94.5pt;z-index:251659264;mso-wrap-style:square;mso-position-horizontal:absolute;mso-position-horizontal-relative:text;mso-position-vertical:absolute;mso-position-vertical-relative:text;v-text-anchor:top" o:spid="_x0000_s1026" fillcolor="#E6F3FF" strokecolor="#0070C0" strokeweight="2pt" type="#_x0000_t202">
                 <v:textbox>
                   <w:txbxContent>
                     <w:p>
@@ -114,6 +114,7 @@
                     </w:p>
                   </w:txbxContent>
                 </v:textbox>
+                <w10:wrap type="topAndBottom"/>
               </v:shape>
             </w:pict>
           </mc:Fallback>

</xml_diff>